<commit_message>
Added UI to the Crypto prevention module
</commit_message>
<xml_diff>
--- a/Transactional Fraud Detection - 3 (2).docx
+++ b/Transactional Fraud Detection - 3 (2).docx
@@ -4,7 +4,15 @@
   <w:body>
     <w:p>
       <w:pPr>
+        <w:ind w:right="-227"/>
         <w:jc w:val="center"/>
+        <w:rPr>
+          <w:rFonts w:ascii="Times New Roman" w:eastAsia="Times New Roman" w:hAnsi="Times New Roman" w:cs="Times New Roman"/>
+          <w:b/>
+          <w:bCs/>
+        </w:rPr>
+      </w:pPr>
+      <w:r>
         <w:rPr>
           <w:rFonts w:ascii="Times New Roman" w:eastAsia="Times New Roman" w:hAnsi="Times New Roman" w:cs="Times New Roman"/>
           <w:b/>
@@ -12,7 +20,8 @@
           <w:sz w:val="28"/>
           <w:szCs w:val="28"/>
         </w:rPr>
-      </w:pPr>
+        <w:t>A Spectral-temporal Graph Network for Camouflage Fraud Prevention and analysis using</w:t>
+      </w:r>
       <w:r>
         <w:rPr>
           <w:rFonts w:ascii="Times New Roman" w:eastAsia="Times New Roman" w:hAnsi="Times New Roman" w:cs="Times New Roman"/>
@@ -21,12 +30,42 @@
           <w:sz w:val="28"/>
           <w:szCs w:val="28"/>
         </w:rPr>
-        <w:t>A Spectral-Temporal Graph Network for Robust Camouflage Fraud Prevention using Learnable Band pass Filtering, Gated attention mechanism and Dual view Learning</w:t>
-      </w:r>
-    </w:p>
-    <w:p>
-      <w:pPr>
-        <w:jc w:val="both"/>
+        <w:t xml:space="preserve"> </w:t>
+      </w:r>
+      <w:r>
+        <w:rPr>
+          <w:rFonts w:ascii="Times New Roman" w:eastAsia="Times New Roman" w:hAnsi="Times New Roman" w:cs="Times New Roman"/>
+          <w:b/>
+          <w:bCs/>
+          <w:sz w:val="28"/>
+          <w:szCs w:val="28"/>
+        </w:rPr>
+        <w:t>learnable band pass filtering</w:t>
+      </w:r>
+      <w:r>
+        <w:rPr>
+          <w:rFonts w:ascii="Times New Roman" w:eastAsia="Times New Roman" w:hAnsi="Times New Roman" w:cs="Times New Roman"/>
+          <w:b/>
+          <w:bCs/>
+          <w:sz w:val="28"/>
+          <w:szCs w:val="28"/>
+        </w:rPr>
+        <w:t xml:space="preserve"> on</w:t>
+      </w:r>
+      <w:r>
+        <w:rPr>
+          <w:rFonts w:ascii="Times New Roman" w:eastAsia="Times New Roman" w:hAnsi="Times New Roman" w:cs="Times New Roman"/>
+          <w:b/>
+          <w:bCs/>
+          <w:sz w:val="28"/>
+          <w:szCs w:val="28"/>
+        </w:rPr>
+        <w:t xml:space="preserve"> Gated attention mechanism and Dual view learner</w:t>
+      </w:r>
+    </w:p>
+    <w:p>
+      <w:pPr>
+        <w:jc w:val="center"/>
         <w:rPr>
           <w:rFonts w:ascii="Times New Roman" w:eastAsia="Times New Roman" w:hAnsi="Times New Roman" w:cs="Times New Roman"/>
           <w:sz w:val="24"/>
@@ -8144,7 +8183,7 @@
           <w:szCs w:val="24"/>
           <w:lang w:val="en-GB"/>
         </w:rPr>
-        <w:t>Spectral Graph Filtering (Learnable Band-Pass Filter)</w:t>
+        <w:t>Spectral Graph Filtering (Learnable Band-Pass Filter):</w:t>
       </w:r>
       <w:r>
         <w:rPr>
@@ -8153,26 +8192,8 @@
           <w:szCs w:val="24"/>
           <w:lang w:val="en-GB"/>
         </w:rPr>
-        <w:t>:</w:t>
-      </w:r>
-      <w:r>
-        <w:rPr>
-          <w:rFonts w:ascii="Times New Roman" w:eastAsia="Times New Roman" w:hAnsi="Times New Roman" w:cs="Times New Roman"/>
-          <w:sz w:val="24"/>
-          <w:szCs w:val="24"/>
-          <w:lang w:val="en-GB"/>
-        </w:rPr>
         <w:br/>
-        <w:t>Spectral graph filtering transforms graph signals into the frequency domain and filters out high-frequency noise that may be introduced by adversarial attacks.</w:t>
-      </w:r>
-      <w:r>
-        <w:rPr>
-          <w:rFonts w:ascii="Times New Roman" w:eastAsia="Times New Roman" w:hAnsi="Times New Roman" w:cs="Times New Roman"/>
-          <w:sz w:val="24"/>
-          <w:szCs w:val="24"/>
-          <w:lang w:val="en-GB"/>
-        </w:rPr>
-        <w:t xml:space="preserve"> </w:t>
+        <w:t xml:space="preserve">Spectral graph filtering transforms graph signals into the frequency domain and filters out high-frequency noise that may be introduced by adversarial attacks. </w:t>
       </w:r>
       <w:r>
         <w:rPr>
@@ -8326,16 +8347,7 @@
           <w:szCs w:val="24"/>
           <w:lang w:val="en-GB"/>
         </w:rPr>
-        <w:t>Reinforcement Learning Edge Selection</w:t>
-      </w:r>
-      <w:r>
-        <w:rPr>
-          <w:rFonts w:ascii="Times New Roman" w:eastAsia="Times New Roman" w:hAnsi="Times New Roman" w:cs="Times New Roman"/>
-          <w:sz w:val="24"/>
-          <w:szCs w:val="24"/>
-          <w:lang w:val="en-GB"/>
-        </w:rPr>
-        <w:t>:</w:t>
+        <w:t>Reinforcement Learning Edge Selection:</w:t>
       </w:r>
       <w:r>
         <w:rPr>
@@ -8430,16 +8442,7 @@
           <w:szCs w:val="24"/>
           <w:lang w:val="en-GB"/>
         </w:rPr>
-        <w:t>Temporal Drift Detection using LSTM</w:t>
-      </w:r>
-      <w:r>
-        <w:rPr>
-          <w:rFonts w:ascii="Times New Roman" w:eastAsia="Times New Roman" w:hAnsi="Times New Roman" w:cs="Times New Roman"/>
-          <w:sz w:val="24"/>
-          <w:szCs w:val="24"/>
-          <w:lang w:val="en-GB"/>
-        </w:rPr>
-        <w:t>:</w:t>
+        <w:t>Temporal Drift Detection using LSTM:</w:t>
       </w:r>
       <w:r>
         <w:rPr>
@@ -13045,6 +13048,7 @@
   <w:style w:type="character" w:default="1" w:styleId="DefaultParagraphFont">
     <w:name w:val="Default Paragraph Font"/>
     <w:uiPriority w:val="1"/>
+    <w:semiHidden/>
     <w:unhideWhenUsed/>
   </w:style>
   <w:style w:type="table" w:default="1" w:styleId="TableNormal">

</xml_diff>